<commit_message>
Store daily recap Word us_market_recap_2026-10-16_BJT_us_2026-10-15_final
</commit_message>
<xml_diff>
--- a/reports/us_market_recap_2026-10-16_BJT_us_2026-10-15_final.docx
+++ b/reports/us_market_recap_2026-10-16_BJT_us_2026-10-15_final.docx
@@ -7450,7 +7450,7 @@
                 <w:color w:val="141414"/>
                 <w:sz w:val="16"/>
               </w:rPr>
-              <w:t>2026-10-16</w:t>
+              <w:t>不可得</w:t>
             </w:r>
           </w:p>
         </w:tc>
@@ -7476,7 +7476,7 @@
                 <w:color w:val="141414"/>
                 <w:sz w:val="16"/>
               </w:rPr>
-              <w:t>0.13</w:t>
+              <w:t>nan</w:t>
             </w:r>
           </w:p>
         </w:tc>
@@ -7502,7 +7502,7 @@
                 <w:color w:val="141414"/>
                 <w:sz w:val="16"/>
               </w:rPr>
-              <w:t>25.4%</w:t>
+              <w:t>nan%</w:t>
             </w:r>
           </w:p>
         </w:tc>
@@ -7528,7 +7528,7 @@
                 <w:color w:val="141414"/>
                 <w:sz w:val="16"/>
               </w:rPr>
-              <w:t>put-heavy, strike-concentration</w:t>
+              <w:t>source unavailable</w:t>
             </w:r>
           </w:p>
         </w:tc>
@@ -7586,7 +7586,7 @@
                 <w:color w:val="141414"/>
                 <w:sz w:val="16"/>
               </w:rPr>
-              <w:t>2026-10-16</w:t>
+              <w:t>不可得</w:t>
             </w:r>
           </w:p>
         </w:tc>
@@ -7612,7 +7612,7 @@
                 <w:color w:val="141414"/>
                 <w:sz w:val="16"/>
               </w:rPr>
-              <w:t>0.90</w:t>
+              <w:t>nan</w:t>
             </w:r>
           </w:p>
         </w:tc>
@@ -7638,7 +7638,7 @@
                 <w:color w:val="141414"/>
                 <w:sz w:val="16"/>
               </w:rPr>
-              <w:t>11.5%</w:t>
+              <w:t>nan%</w:t>
             </w:r>
           </w:p>
         </w:tc>
@@ -7664,7 +7664,7 @@
                 <w:color w:val="141414"/>
                 <w:sz w:val="16"/>
               </w:rPr>
-              <w:t>无阈值报警</w:t>
+              <w:t>source unavailable</w:t>
             </w:r>
           </w:p>
         </w:tc>
@@ -8130,6 +8130,142 @@
                 <w:color w:val="141414"/>
                 <w:sz w:val="16"/>
               </w:rPr>
+              <w:t>2026-10-16</w:t>
+            </w:r>
+          </w:p>
+        </w:tc>
+        <w:tc>
+          <w:tcPr>
+            <w:tcW w:type="dxa" w:w="1800"/>
+            <w:vAlign w:val="center"/>
+            <w:shd w:fill="FFFFFF"/>
+            <w:tcMar>
+              <w:top w:w="90" w:type="dxa"/>
+              <w:start w:w="90" w:type="dxa"/>
+              <w:bottom w:w="90" w:type="dxa"/>
+              <w:end w:w="90" w:type="dxa"/>
+            </w:tcMar>
+          </w:tcPr>
+          <w:p>
+            <w:pPr>
+              <w:spacing w:before="60" w:after="60" w:line="240" w:lineRule="auto"/>
+            </w:pPr>
+            <w:r>
+              <w:rPr>
+                <w:b w:val="0"/>
+                <w:color w:val="141414"/>
+                <w:sz w:val="16"/>
+              </w:rPr>
+              <w:t>0.73</w:t>
+            </w:r>
+          </w:p>
+        </w:tc>
+        <w:tc>
+          <w:tcPr>
+            <w:tcW w:type="dxa" w:w="2016"/>
+            <w:vAlign w:val="center"/>
+            <w:shd w:fill="FFFFFF"/>
+            <w:tcMar>
+              <w:top w:w="90" w:type="dxa"/>
+              <w:start w:w="90" w:type="dxa"/>
+              <w:bottom w:w="90" w:type="dxa"/>
+              <w:end w:w="90" w:type="dxa"/>
+            </w:tcMar>
+          </w:tcPr>
+          <w:p>
+            <w:pPr>
+              <w:spacing w:before="60" w:after="60" w:line="240" w:lineRule="auto"/>
+            </w:pPr>
+            <w:r>
+              <w:rPr>
+                <w:b w:val="0"/>
+                <w:color w:val="141414"/>
+                <w:sz w:val="16"/>
+              </w:rPr>
+              <w:t>9.6%</w:t>
+            </w:r>
+          </w:p>
+        </w:tc>
+        <w:tc>
+          <w:tcPr>
+            <w:tcW w:type="dxa" w:w="2880"/>
+            <w:vAlign w:val="center"/>
+            <w:shd w:fill="FFFFFF"/>
+            <w:tcMar>
+              <w:top w:w="90" w:type="dxa"/>
+              <w:start w:w="90" w:type="dxa"/>
+              <w:bottom w:w="90" w:type="dxa"/>
+              <w:end w:w="90" w:type="dxa"/>
+            </w:tcMar>
+          </w:tcPr>
+          <w:p>
+            <w:pPr>
+              <w:spacing w:before="60" w:after="60" w:line="240" w:lineRule="auto"/>
+            </w:pPr>
+            <w:r>
+              <w:rPr>
+                <w:b w:val="0"/>
+                <w:color w:val="141414"/>
+                <w:sz w:val="16"/>
+              </w:rPr>
+              <w:t>无阈值报警</w:t>
+            </w:r>
+          </w:p>
+        </w:tc>
+      </w:tr>
+      <w:tr>
+        <w:trPr>
+          <w:cantSplit/>
+        </w:trPr>
+        <w:tc>
+          <w:tcPr>
+            <w:tcW w:type="dxa" w:w="1080"/>
+            <w:vAlign w:val="center"/>
+            <w:shd w:fill="FFFFFF"/>
+            <w:tcMar>
+              <w:top w:w="90" w:type="dxa"/>
+              <w:start w:w="90" w:type="dxa"/>
+              <w:bottom w:w="90" w:type="dxa"/>
+              <w:end w:w="90" w:type="dxa"/>
+            </w:tcMar>
+          </w:tcPr>
+          <w:p>
+            <w:pPr>
+              <w:spacing w:before="60" w:after="60" w:line="240" w:lineRule="auto"/>
+              <w:jc w:val="center"/>
+            </w:pPr>
+            <w:r>
+              <w:rPr>
+                <w:b w:val="0"/>
+                <w:color w:val="141414"/>
+                <w:sz w:val="16"/>
+              </w:rPr>
+              <w:t>META</w:t>
+            </w:r>
+          </w:p>
+        </w:tc>
+        <w:tc>
+          <w:tcPr>
+            <w:tcW w:type="dxa" w:w="1656"/>
+            <w:vAlign w:val="center"/>
+            <w:shd w:fill="FFFFFF"/>
+            <w:tcMar>
+              <w:top w:w="90" w:type="dxa"/>
+              <w:start w:w="90" w:type="dxa"/>
+              <w:bottom w:w="90" w:type="dxa"/>
+              <w:end w:w="90" w:type="dxa"/>
+            </w:tcMar>
+          </w:tcPr>
+          <w:p>
+            <w:pPr>
+              <w:spacing w:before="60" w:after="60" w:line="240" w:lineRule="auto"/>
+            </w:pPr>
+            <w:r>
+              <w:rPr>
+                <w:b w:val="0"/>
+                <w:color w:val="141414"/>
+                <w:sz w:val="16"/>
+              </w:rPr>
               <w:t>不可得</w:t>
             </w:r>
           </w:p>
@@ -8209,142 +8345,6 @@
                 <w:sz w:val="16"/>
               </w:rPr>
               <w:t>source unavailable</w:t>
-            </w:r>
-          </w:p>
-        </w:tc>
-      </w:tr>
-      <w:tr>
-        <w:trPr>
-          <w:cantSplit/>
-        </w:trPr>
-        <w:tc>
-          <w:tcPr>
-            <w:tcW w:type="dxa" w:w="1080"/>
-            <w:vAlign w:val="center"/>
-            <w:shd w:fill="FFFFFF"/>
-            <w:tcMar>
-              <w:top w:w="90" w:type="dxa"/>
-              <w:start w:w="90" w:type="dxa"/>
-              <w:bottom w:w="90" w:type="dxa"/>
-              <w:end w:w="90" w:type="dxa"/>
-            </w:tcMar>
-          </w:tcPr>
-          <w:p>
-            <w:pPr>
-              <w:spacing w:before="60" w:after="60" w:line="240" w:lineRule="auto"/>
-              <w:jc w:val="center"/>
-            </w:pPr>
-            <w:r>
-              <w:rPr>
-                <w:b w:val="0"/>
-                <w:color w:val="141414"/>
-                <w:sz w:val="16"/>
-              </w:rPr>
-              <w:t>META</w:t>
-            </w:r>
-          </w:p>
-        </w:tc>
-        <w:tc>
-          <w:tcPr>
-            <w:tcW w:type="dxa" w:w="1656"/>
-            <w:vAlign w:val="center"/>
-            <w:shd w:fill="FFFFFF"/>
-            <w:tcMar>
-              <w:top w:w="90" w:type="dxa"/>
-              <w:start w:w="90" w:type="dxa"/>
-              <w:bottom w:w="90" w:type="dxa"/>
-              <w:end w:w="90" w:type="dxa"/>
-            </w:tcMar>
-          </w:tcPr>
-          <w:p>
-            <w:pPr>
-              <w:spacing w:before="60" w:after="60" w:line="240" w:lineRule="auto"/>
-            </w:pPr>
-            <w:r>
-              <w:rPr>
-                <w:b w:val="0"/>
-                <w:color w:val="141414"/>
-                <w:sz w:val="16"/>
-              </w:rPr>
-              <w:t>2026-10-16</w:t>
-            </w:r>
-          </w:p>
-        </w:tc>
-        <w:tc>
-          <w:tcPr>
-            <w:tcW w:type="dxa" w:w="1800"/>
-            <w:vAlign w:val="center"/>
-            <w:shd w:fill="FFFFFF"/>
-            <w:tcMar>
-              <w:top w:w="90" w:type="dxa"/>
-              <w:start w:w="90" w:type="dxa"/>
-              <w:bottom w:w="90" w:type="dxa"/>
-              <w:end w:w="90" w:type="dxa"/>
-            </w:tcMar>
-          </w:tcPr>
-          <w:p>
-            <w:pPr>
-              <w:spacing w:before="60" w:after="60" w:line="240" w:lineRule="auto"/>
-            </w:pPr>
-            <w:r>
-              <w:rPr>
-                <w:b w:val="0"/>
-                <w:color w:val="141414"/>
-                <w:sz w:val="16"/>
-              </w:rPr>
-              <w:t>2.14</w:t>
-            </w:r>
-          </w:p>
-        </w:tc>
-        <w:tc>
-          <w:tcPr>
-            <w:tcW w:type="dxa" w:w="2016"/>
-            <w:vAlign w:val="center"/>
-            <w:shd w:fill="FFFFFF"/>
-            <w:tcMar>
-              <w:top w:w="90" w:type="dxa"/>
-              <w:start w:w="90" w:type="dxa"/>
-              <w:bottom w:w="90" w:type="dxa"/>
-              <w:end w:w="90" w:type="dxa"/>
-            </w:tcMar>
-          </w:tcPr>
-          <w:p>
-            <w:pPr>
-              <w:spacing w:before="60" w:after="60" w:line="240" w:lineRule="auto"/>
-            </w:pPr>
-            <w:r>
-              <w:rPr>
-                <w:b w:val="0"/>
-                <w:color w:val="141414"/>
-                <w:sz w:val="16"/>
-              </w:rPr>
-              <w:t>9.6%</w:t>
-            </w:r>
-          </w:p>
-        </w:tc>
-        <w:tc>
-          <w:tcPr>
-            <w:tcW w:type="dxa" w:w="2880"/>
-            <w:vAlign w:val="center"/>
-            <w:shd w:fill="FFFFFF"/>
-            <w:tcMar>
-              <w:top w:w="90" w:type="dxa"/>
-              <w:start w:w="90" w:type="dxa"/>
-              <w:bottom w:w="90" w:type="dxa"/>
-              <w:end w:w="90" w:type="dxa"/>
-            </w:tcMar>
-          </w:tcPr>
-          <w:p>
-            <w:pPr>
-              <w:spacing w:before="60" w:after="60" w:line="240" w:lineRule="auto"/>
-            </w:pPr>
-            <w:r>
-              <w:rPr>
-                <w:b w:val="0"/>
-                <w:color w:val="141414"/>
-                <w:sz w:val="16"/>
-              </w:rPr>
-              <w:t>无阈值报警</w:t>
             </w:r>
           </w:p>
         </w:tc>
@@ -8674,7 +8674,7 @@
                 <w:color w:val="141414"/>
                 <w:sz w:val="16"/>
               </w:rPr>
-              <w:t>2026-10-16</w:t>
+              <w:t>不可得</w:t>
             </w:r>
           </w:p>
         </w:tc>
@@ -8700,7 +8700,7 @@
                 <w:color w:val="141414"/>
                 <w:sz w:val="16"/>
               </w:rPr>
-              <w:t>1.50</w:t>
+              <w:t>nan</w:t>
             </w:r>
           </w:p>
         </w:tc>
@@ -8726,7 +8726,7 @@
                 <w:color w:val="141414"/>
                 <w:sz w:val="16"/>
               </w:rPr>
-              <w:t>45.4%</w:t>
+              <w:t>nan%</w:t>
             </w:r>
           </w:p>
         </w:tc>
@@ -8752,7 +8752,7 @@
                 <w:color w:val="141414"/>
                 <w:sz w:val="16"/>
               </w:rPr>
-              <w:t>strike-concentration</w:t>
+              <w:t>source unavailable</w:t>
             </w:r>
           </w:p>
         </w:tc>
@@ -9179,7 +9179,7 @@
       <w:r>
         <w:drawing>
           <wp:inline xmlns:a="http://schemas.openxmlformats.org/drawingml/2006/main" xmlns:pic="http://schemas.openxmlformats.org/drawingml/2006/picture">
-            <wp:extent cx="5806440" cy="3658449"/>
+            <wp:extent cx="5806440" cy="3885095"/>
             <wp:docPr id="25" name="Picture 25"/>
             <wp:cNvGraphicFramePr>
               <a:graphicFrameLocks noChangeAspect="1"/>
@@ -9200,7 +9200,7 @@
                   <pic:spPr>
                     <a:xfrm>
                       <a:off x="0" y="0"/>
-                      <a:ext cx="5806440" cy="3658449"/>
+                      <a:ext cx="5806440" cy="3885095"/>
                     </a:xfrm>
                     <a:prstGeom prst="rect"/>
                   </pic:spPr>
@@ -9221,7 +9221,7 @@
           <w:color w:val="555555"/>
           <w:sz w:val="17"/>
         </w:rPr>
-        <w:t>图：公开期权链异常扫描。来源/口径：Nasdaq public option-chain endpoint；检查时点 2026-10-15T19:37:48-04:00；无执行方向确认。。</w:t>
+        <w:t>图：公开期权链异常扫描。来源/口径：Nasdaq public option-chain endpoint；检查时点 2026-10-15T19:41:18-04:00；无执行方向确认。。</w:t>
       </w:r>
     </w:p>
     <w:p>
@@ -9262,6 +9262,15 @@
         <w:rPr>
           <w:shd w:fill="E7E6E6"/>
         </w:rPr>
+        <w:t>AAOI</w:t>
+      </w:r>
+      <w:r>
+        <w:t xml:space="preserve">, </w:t>
+      </w:r>
+      <w:r>
+        <w:rPr>
+          <w:shd w:fill="E7E6E6"/>
+        </w:rPr>
         <w:t>MU</w:t>
       </w:r>
       <w:r>
@@ -9280,7 +9289,7 @@
         <w:rPr>
           <w:shd w:fill="E7E6E6"/>
         </w:rPr>
-        <w:t>AVGO</w:t>
+        <w:t>META</w:t>
       </w:r>
       <w:r>
         <w:t xml:space="preserve">, </w:t>
@@ -9362,7 +9371,7 @@
       <w:r>
         <w:drawing>
           <wp:inline xmlns:a="http://schemas.openxmlformats.org/drawingml/2006/main" xmlns:pic="http://schemas.openxmlformats.org/drawingml/2006/picture">
-            <wp:extent cx="5806440" cy="2114090"/>
+            <wp:extent cx="5806440" cy="1990687"/>
             <wp:docPr id="26" name="Picture 26"/>
             <wp:cNvGraphicFramePr>
               <a:graphicFrameLocks noChangeAspect="1"/>
@@ -9383,7 +9392,7 @@
                   <pic:spPr>
                     <a:xfrm>
                       <a:off x="0" y="0"/>
-                      <a:ext cx="5806440" cy="2114090"/>
+                      <a:ext cx="5806440" cy="1990687"/>
                     </a:xfrm>
                     <a:prstGeom prst="rect"/>
                   </pic:spPr>

</xml_diff>